<commit_message>
fix(p10): referee-review defects — robustness count, ref typo, p-value, data cite
Pre-submission referee review (econ-referee-feedback) caught real errors:
- 'six-specification/six-model robustness battery' + 'eleven specifications'
  -> 'four-...' / 'any specification' (Table 5 has 4 rows: R2,R3,R5,R6;
  d3c variant is in Table 3)
- reference author typo 'Perryy, M. Z.' -> 'Perryman, A. A.' (Kirca et al. 2012)
- female-manager number-mixing: '−0.170, p=.010' -> '−0.170, p=.011'
  (−0.170 is the M4/M5 value, p=.011; M3 is −0.171/.010) in abstract+body
- World Bank (2026) data reference was an orphan -> added in-text cite in §3.1
</commit_message>
<xml_diff>
--- a/p10_japan/submission/abm_package/01_manuscript_blinded.docx
+++ b/p10_japan/submission/abm_package/01_manuscript_blinded.docx
@@ -148,7 +148,7 @@
         <w:t xml:space="preserve"> </w:t>
       </w:r>
       <w:r>
-        <w:t xml:space="preserve">Labour productivity, ln(annual sales per permanent worker) winsorised at the 1st and 99th percentiles, is regressed on export intensity (FSTS, direct plus indirect exports over sales) and its square, with sector fixed effects and HC1 robust standard errors, in a hierarchical sequence that adds ownership, firm age, top-manager gender, technological capability (TCI), and digital adoption (DAI). We complement the intensity-margin estimation with an extensive-margin model of export participation and a six-specification robustness battery.</w:t>
+        <w:t xml:space="preserve">Labour productivity, ln(annual sales per permanent worker) winsorised at the 1st and 99th percentiles, is regressed on export intensity (FSTS, direct plus indirect exports over sales) and its square, with sector fixed effects and HC1 robust standard errors, in a hierarchical sequence that adds ownership, firm age, top-manager gender, technological capability (TCI), and digital adoption (DAI). We complement the intensity-margin estimation with an extensive-margin model of export participation and a four-specification robustness battery.</w:t>
       </w:r>
     </w:p>
     <w:p>
@@ -182,7 +182,7 @@
         <w:t xml:space="preserve"> </w:t>
       </w:r>
       <w:r>
-        <w:t xml:space="preserve">tradition (ln-age +0.073, p = .007), and a negative female-top-manager coefficient (−0.170, p = .010) in an economy where only 7.3% of establishments have a female top manager.</w:t>
+        <w:t xml:space="preserve">tradition (ln-age +0.073, p = .007), and a negative female-top-manager coefficient (−0.170, p = .011) in an economy where only 7.3% of establishments have a female top manager.</w:t>
       </w:r>
     </w:p>
     <w:p>
@@ -291,7 +291,7 @@
         <w:pStyle w:val="BodyText"/>
       </w:pPr>
       <w:r>
-        <w:t xml:space="preserve">We make four contributions. First, we provide the first WBES-based I–P estimates for Japan, establishing baseline facts, productivity dispersion, export participation, capability incidence, digital adoption, demographic structure, for an economy that has been systematically absent from comparative firm-level research. Second, we deliver a clean confirmation of the upper-bound prediction: the export-intensity effect is positive and significant in linear form, the quadratic term is never significant across five hierarchical specifications and a six-model robustness battery, and the implied turning point lies far outside the observable range. Third, we shift attention from the intensity margin to the extensive margin and show that, at the frontier, the binding question is not</w:t>
+        <w:t xml:space="preserve">We make four contributions. First, we provide the first WBES-based I–P estimates for Japan, establishing baseline facts, productivity dispersion, export participation, capability incidence, digital adoption, demographic structure, for an economy that has been systematically absent from comparative firm-level research. Second, we deliver a clean confirmation of the upper-bound prediction: the export-intensity effect is positive and significant in linear form, the quadratic term is never significant across five hierarchical specifications and a four-model robustness battery, and the implied turning point lies far outside the observable range. Third, we shift attention from the intensity margin to the extensive margin and show that, at the frontier, the binding question is not</w:t>
       </w:r>
       <w:r>
         <w:t xml:space="preserve"> </w:t>
@@ -708,7 +708,7 @@
         <w:pStyle w:val="FirstParagraph"/>
       </w:pPr>
       <w:r>
-        <w:t xml:space="preserve">We use the complete Japan 2025 WBES cross-section (N = 2,168 establishments; 339 harmonised variables; stratified random sampling by sector, size, and region). The WBES is administered face-to-face to a senior manager or owner using a standardised instrument, and its sampling frame and variable definitions are harmonised across economies, which is what permits direct comparison of Japan with the regional pool. Non-response codes (−9, −8, −7) are recoded as missing throughout.</w:t>
+        <w:t xml:space="preserve">We use the complete Japan 2025 WBES cross-section (World Bank, 2026; N = 2,168 establishments; 339 harmonised variables; stratified random sampling by sector, size, and region). The WBES is administered face-to-face to a senior manager or owner using a standardised instrument, and its sampling frame and variable definitions are harmonised across economies, which is what permits direct comparison of Japan with the regional pool. Non-response codes (−9, −8, −7) are recoded as missing throughout.</w:t>
       </w:r>
     </w:p>
     <w:p>
@@ -776,7 +776,7 @@
         <w:pStyle w:val="BodyText"/>
       </w:pPr>
       <w:r>
-        <w:t xml:space="preserve">We then estimate the extensive margin with a linear probability model of export participation on capability, digital adoption, ownership, age, gender, and firm size, with sector fixed effects and HC1 errors (H4). Finally, a six-specification robustness battery re-estimates the linear and quadratic export effect under alternative controls (adding firm size), subsamples (domestic-owned firms only; exporters only, where the intensity margin is identified off participating firms), and winsorisation thresholds (5th/95th percentiles). All reported estimates are reproducible via</w:t>
+        <w:t xml:space="preserve">We then estimate the extensive margin with a linear probability model of export participation on capability, digital adoption, ownership, age, gender, and firm size, with sector fixed effects and HC1 errors (H4). Finally, a four-specification robustness battery re-estimates the linear and quadratic export effect under alternative controls (adding firm size), subsamples (domestic-owned firms only; exporters only, where the intensity margin is identified off participating firms), and winsorisation thresholds (5th/95th percentiles). All reported estimates are reproducible via</w:t>
       </w:r>
       <w:r>
         <w:t xml:space="preserve"> </w:t>
@@ -3223,7 +3223,7 @@
         <w:t xml:space="preserve"> </w:t>
       </w:r>
       <w:r>
-        <w:t xml:space="preserve">The female-top-manager coefficient is negative and significant (−0.170, p = .010) in the economy with the region's lowest female-leadership share (7.3%). Given the thinness of that margin, the coefficient is most plausibly read as selection of the few female-led establishments into smaller, lower-margin niches rather than as a leadership effect, and we do not interpret it causally. It is reported transparently as a descriptive regularity that disciplines how upper-echelons effects are read across institutional contexts.</w:t>
+        <w:t xml:space="preserve">The female-top-manager coefficient is negative and significant (−0.170, p = .011) in the economy with the region's lowest female-leadership share (7.3%). Given the thinness of that margin, the coefficient is most plausibly read as selection of the few female-led establishments into smaller, lower-margin niches rather than as a leadership effect, and we do not interpret it causally. It is reported transparently as a descriptive regularity that disciplines how upper-echelons effects are read across institutional contexts.</w:t>
       </w:r>
     </w:p>
     <w:bookmarkEnd w:id="34"/>
@@ -3704,7 +3704,7 @@
         <w:pStyle w:val="FirstParagraph"/>
       </w:pPr>
       <w:r>
-        <w:t xml:space="preserve">Table 5 subjects the central finding, a positive linear and a non-significant quadratic export effect, to six alternative specifications. Adding a firm-size control (R2) leaves the linear effect positive (+0.656, p = .046) and the quadratic insignificant (p = .662). Restricting to domestic-owned establishments (R3) strengthens the linear effect (+0.917, p = .012) with the quadratic still insignificant (p = .448), confirming that the result is not driven by the rare foreign-owned firms. Winsorising productivity at the 5th/95th percentiles (R5) yields the same pattern (+0.837, p = .006; quadratic p = .378). Estimating the intensity margin on exporters only (R6, N = 344), where the linear/quadratic terms are identified off participating firms alone, the export-intensity effect is positive but no longer significant (+0.200, p = .410) and the quadratic remains insignificant (p = .551), consistent with the action lying at participation rather than intensity. In no specification, across the full sample, the domestic-owned subsample, alternative winsorisation, or the exporters-only subsample, does the quadratic term attain significance. The monotone-positive-within-range conclusion is robust.</w:t>
+        <w:t xml:space="preserve">Table 5 subjects the central finding, a positive linear and a non-significant quadratic export effect, to four alternative specifications. Adding a firm-size control (R2) leaves the linear effect positive (+0.656, p = .046) and the quadratic insignificant (p = .662). Restricting to domestic-owned establishments (R3) strengthens the linear effect (+0.917, p = .012) with the quadratic still insignificant (p = .448), confirming that the result is not driven by the rare foreign-owned firms. Winsorising productivity at the 5th/95th percentiles (R5) yields the same pattern (+0.837, p = .006; quadratic p = .378). Estimating the intensity margin on exporters only (R6, N = 344), where the linear/quadratic terms are identified off participating firms alone, the export-intensity effect is positive but no longer significant (+0.200, p = .410) and the quadratic remains insignificant (p = .551), consistent with the action lying at participation rather than intensity. In no specification, across the full sample, the domestic-owned subsample, alternative winsorisation, or the exporters-only subsample, does the quadratic term attain significance. The monotone-positive-within-range conclusion is robust.</w:t>
       </w:r>
     </w:p>
     <w:p>
@@ -4256,7 +4256,7 @@
         <w:pStyle w:val="FirstParagraph"/>
       </w:pPr>
       <w:r>
-        <w:t xml:space="preserve">Using Japan's first-ever World Bank Enterprise Survey, we show that at the upper bound of the institutional gradient the internationalization–performance relationship is monotonically positive within the observable range, with no statistically detectable turning point in any of eleven specifications. Technological capability and digital adoption raise productivity levels without reshaping the curve; firm longevity carries a measurable premium consistent with the</w:t>
+        <w:t xml:space="preserve">Using Japan's first-ever World Bank Enterprise Survey, we show that at the upper bound of the institutional gradient the internationalization–performance relationship is monotonically positive within the observable range, with no statistically detectable turning point in any specification. Technological capability and digital adoption raise productivity levels without reshaping the curve; firm longevity carries a measurable premium consistent with the</w:t>
       </w:r>
       <w:r>
         <w:t xml:space="preserve"> </w:t>
@@ -4587,7 +4587,7 @@
         <w:pStyle w:val="BodyText"/>
       </w:pPr>
       <w:r>
-        <w:t xml:space="preserve">Kirca, A. H., Hult, G. T. M., Deligonul, S., Perryy, M. Z., &amp; Cavusgil, S. T. (2012). A multilevel examination of the drivers of firm multinationality–performance relationship.</w:t>
+        <w:t xml:space="preserve">Kirca, A. H., Hult, G. T. M., Deligonul, S., Perryman, A. A., &amp; Cavusgil, S. T. (2012). A multilevel examination of the drivers of firm multinationality–performance relationship.</w:t>
       </w:r>
       <w:r>
         <w:t xml:space="preserve"> </w:t>

</xml_diff>